<commit_message>
Rebuild full exams to match JPG A4 layout; pack answers on one page.
Character boxes and spacing follow unit-test scans; answer keys stay paper-light.

Co-authored-by: Cursor <cursoragent@cursor.com>
</commit_message>
<xml_diff>
--- a/printables/full-answers/u01-full-answers.docx
+++ b/printables/full-answers/u01-full-answers.docx
@@ -4,7 +4,7 @@
   <w:body>
     <w:p>
       <w:pPr>
-        <w:spacing w:before="0" w:after="40" w:line="269" w:lineRule="auto"/>
+        <w:spacing w:before="0" w:after="20" w:line="252" w:lineRule="auto"/>
         <w:jc w:val="center"/>
       </w:pPr>
       <w:r>
@@ -12,14 +12,14 @@
           <w:rFonts w:ascii="宋体" w:hAnsi="宋体" w:eastAsia="宋体"/>
           <w:b/>
           <w:color w:val="F4A261"/>
-          <w:sz w:val="18"/>
+          <w:sz w:val="16"/>
         </w:rPr>
         <w:t>语文书桌 · 参考答案（做完再看）</w:t>
       </w:r>
     </w:p>
     <w:p>
       <w:pPr>
-        <w:spacing w:before="0" w:after="40" w:line="269" w:lineRule="auto"/>
+        <w:spacing w:before="0" w:after="20" w:line="252" w:lineRule="auto"/>
         <w:jc w:val="center"/>
       </w:pPr>
       <w:r>
@@ -27,14 +27,14 @@
           <w:rFonts w:ascii="黑体" w:hAnsi="黑体" w:eastAsia="黑体"/>
           <w:b/>
           <w:color w:val="E85D04"/>
-          <w:sz w:val="30"/>
+          <w:sz w:val="26"/>
         </w:rPr>
         <w:t>第一单元完整摸底卷 · 参考答案</w:t>
       </w:r>
     </w:p>
     <w:p>
       <w:pPr>
-        <w:spacing w:before="0" w:after="120" w:line="269" w:lineRule="auto"/>
+        <w:spacing w:before="0" w:after="80" w:line="252" w:lineRule="auto"/>
         <w:jc w:val="center"/>
       </w:pPr>
       <w:r>
@@ -42,14 +42,280 @@
           <w:rFonts w:ascii="宋体" w:hAnsi="宋体" w:eastAsia="宋体"/>
           <w:b w:val="0"/>
           <w:color w:val="C2410C"/>
-          <w:sz w:val="20"/>
+          <w:sz w:val="16"/>
         </w:rPr>
-        <w:t>单独答案页 · 可打印 A4　|　先做卷再对答案</w:t>
+        <w:t>单独答案页 · 尽量一页打完　|　先做卷再对答案</w:t>
       </w:r>
     </w:p>
     <w:p>
       <w:pPr>
-        <w:spacing w:before="0" w:after="80" w:line="269" w:lineRule="auto"/>
+        <w:spacing w:before="80" w:after="20" w:line="252" w:lineRule="auto"/>
+      </w:pPr>
+      <w:r>
+        <w:rPr>
+          <w:rFonts w:ascii="宋体" w:hAnsi="宋体" w:eastAsia="宋体"/>
+          <w:b/>
+          <w:color w:val="E85D04"/>
+          <w:sz w:val="20"/>
+        </w:rPr>
+        <w:t>一、看拼音写词语</w:t>
+      </w:r>
+    </w:p>
+    <w:p>
+      <w:pPr>
+        <w:spacing w:before="0" w:after="20" w:line="252" w:lineRule="auto"/>
+      </w:pPr>
+      <w:r>
+        <w:rPr>
+          <w:rFonts w:ascii="宋体" w:hAnsi="宋体" w:eastAsia="宋体"/>
+          <w:b w:val="0"/>
+          <w:color w:val="1C1917"/>
+          <w:sz w:val="19"/>
+        </w:rPr>
+        <w:t>繁星；模糊；飞舞；柔和；梦幻</w:t>
+      </w:r>
+    </w:p>
+    <w:p>
+      <w:pPr>
+        <w:spacing w:before="80" w:after="20" w:line="252" w:lineRule="auto"/>
+      </w:pPr>
+      <w:r>
+        <w:rPr>
+          <w:rFonts w:ascii="宋体" w:hAnsi="宋体" w:eastAsia="宋体"/>
+          <w:b/>
+          <w:color w:val="E85D04"/>
+          <w:sz w:val="20"/>
+        </w:rPr>
+        <w:t>二、读音有误</w:t>
+      </w:r>
+    </w:p>
+    <w:p>
+      <w:pPr>
+        <w:spacing w:before="0" w:after="20" w:line="252" w:lineRule="auto"/>
+      </w:pPr>
+      <w:r>
+        <w:rPr>
+          <w:rFonts w:ascii="宋体" w:hAnsi="宋体" w:eastAsia="宋体"/>
+          <w:b w:val="0"/>
+          <w:color w:val="1C1917"/>
+          <w:sz w:val="19"/>
+        </w:rPr>
+        <w:t>1.③（萤火虫 yíng）　2.②（霎时 shà）　3.无（均正确；若③印成 qiāo 则选③）</w:t>
+      </w:r>
+    </w:p>
+    <w:p>
+      <w:pPr>
+        <w:spacing w:before="80" w:after="20" w:line="252" w:lineRule="auto"/>
+      </w:pPr>
+      <w:r>
+        <w:rPr>
+          <w:rFonts w:ascii="宋体" w:hAnsi="宋体" w:eastAsia="宋体"/>
+          <w:b/>
+          <w:color w:val="E85D04"/>
+          <w:sz w:val="20"/>
+        </w:rPr>
+        <w:t>三、错别字</w:t>
+      </w:r>
+    </w:p>
+    <w:p>
+      <w:pPr>
+        <w:spacing w:before="0" w:after="20" w:line="252" w:lineRule="auto"/>
+      </w:pPr>
+      <w:r>
+        <w:rPr>
+          <w:rFonts w:ascii="宋体" w:hAnsi="宋体" w:eastAsia="宋体"/>
+          <w:b w:val="0"/>
+          <w:color w:val="1C1917"/>
+          <w:sz w:val="19"/>
+        </w:rPr>
+        <w:t>1.蜜→密　2.近→进　3.浙→渐</w:t>
+      </w:r>
+    </w:p>
+    <w:p>
+      <w:pPr>
+        <w:spacing w:before="80" w:after="20" w:line="252" w:lineRule="auto"/>
+      </w:pPr>
+      <w:r>
+        <w:rPr>
+          <w:rFonts w:ascii="宋体" w:hAnsi="宋体" w:eastAsia="宋体"/>
+          <w:b/>
+          <w:color w:val="E85D04"/>
+          <w:sz w:val="20"/>
+        </w:rPr>
+        <w:t>四、填空</w:t>
+      </w:r>
+    </w:p>
+    <w:p>
+      <w:pPr>
+        <w:spacing w:before="0" w:after="20" w:line="252" w:lineRule="auto"/>
+      </w:pPr>
+      <w:r>
+        <w:rPr>
+          <w:rFonts w:ascii="宋体" w:hAnsi="宋体" w:eastAsia="宋体"/>
+          <w:b w:val="0"/>
+          <w:color w:val="1C1917"/>
+          <w:sz w:val="19"/>
+        </w:rPr>
+        <w:t>第六笔：横；“外围”选②（四周；周围）</w:t>
+      </w:r>
+    </w:p>
+    <w:p>
+      <w:pPr>
+        <w:spacing w:before="80" w:after="20" w:line="252" w:lineRule="auto"/>
+      </w:pPr>
+      <w:r>
+        <w:rPr>
+          <w:rFonts w:ascii="宋体" w:hAnsi="宋体" w:eastAsia="宋体"/>
+          <w:b/>
+          <w:color w:val="E85D04"/>
+          <w:sz w:val="20"/>
+        </w:rPr>
+        <w:t>五、词语补充</w:t>
+      </w:r>
+    </w:p>
+    <w:p>
+      <w:pPr>
+        <w:spacing w:before="0" w:after="20" w:line="252" w:lineRule="auto"/>
+      </w:pPr>
+      <w:r>
+        <w:rPr>
+          <w:rFonts w:ascii="宋体" w:hAnsi="宋体" w:eastAsia="宋体"/>
+          <w:b w:val="0"/>
+          <w:color w:val="1C1917"/>
+          <w:sz w:val="19"/>
+        </w:rPr>
+        <w:t>①细②无③云④悄⑤私⑥欲；1.①②④⑤；2.画面描写通顺即可</w:t>
+      </w:r>
+    </w:p>
+    <w:p>
+      <w:pPr>
+        <w:spacing w:before="80" w:after="20" w:line="252" w:lineRule="auto"/>
+      </w:pPr>
+      <w:r>
+        <w:rPr>
+          <w:rFonts w:ascii="宋体" w:hAnsi="宋体" w:eastAsia="宋体"/>
+          <w:b/>
+          <w:color w:val="E85D04"/>
+          <w:sz w:val="20"/>
+        </w:rPr>
+        <w:t>六、片段描写</w:t>
+      </w:r>
+    </w:p>
+    <w:p>
+      <w:pPr>
+        <w:spacing w:before="0" w:after="20" w:line="252" w:lineRule="auto"/>
+      </w:pPr>
+      <w:r>
+        <w:rPr>
+          <w:rFonts w:ascii="宋体" w:hAnsi="宋体" w:eastAsia="宋体"/>
+          <w:b w:val="0"/>
+          <w:color w:val="1C1917"/>
+          <w:sz w:val="19"/>
+        </w:rPr>
+        <w:t>用上加点时间词、通顺即可</w:t>
+      </w:r>
+    </w:p>
+    <w:p>
+      <w:pPr>
+        <w:spacing w:before="80" w:after="20" w:line="252" w:lineRule="auto"/>
+      </w:pPr>
+      <w:r>
+        <w:rPr>
+          <w:rFonts w:ascii="宋体" w:hAnsi="宋体" w:eastAsia="宋体"/>
+          <w:b/>
+          <w:color w:val="E85D04"/>
+          <w:sz w:val="20"/>
+        </w:rPr>
+        <w:t>七、古诗</w:t>
+      </w:r>
+    </w:p>
+    <w:p>
+      <w:pPr>
+        <w:spacing w:before="0" w:after="20" w:line="252" w:lineRule="auto"/>
+      </w:pPr>
+      <w:r>
+        <w:rPr>
+          <w:rFonts w:ascii="宋体" w:hAnsi="宋体" w:eastAsia="宋体"/>
+          <w:b w:val="0"/>
+          <w:color w:val="1C1917"/>
+          <w:sz w:val="19"/>
+        </w:rPr>
+        <w:t>宋　苏轼　（②）</w:t>
+      </w:r>
+    </w:p>
+    <w:p>
+      <w:pPr>
+        <w:spacing w:before="80" w:after="20" w:line="252" w:lineRule="auto"/>
+      </w:pPr>
+      <w:r>
+        <w:rPr>
+          <w:rFonts w:ascii="宋体" w:hAnsi="宋体" w:eastAsia="宋体"/>
+          <w:b/>
+          <w:color w:val="E85D04"/>
+          <w:sz w:val="20"/>
+        </w:rPr>
+        <w:t>八、阅读</w:t>
+      </w:r>
+    </w:p>
+    <w:p>
+      <w:pPr>
+        <w:spacing w:before="0" w:after="20" w:line="252" w:lineRule="auto"/>
+      </w:pPr>
+      <w:r>
+        <w:rPr>
+          <w:rFonts w:ascii="宋体" w:hAnsi="宋体" w:eastAsia="宋体"/>
+          <w:b w:val="0"/>
+          <w:color w:val="1C1917"/>
+          <w:sz w:val="19"/>
+        </w:rPr>
+        <w:t>（一）1.②淡紫色、①文雅　2.画：却也能为一个可怜的蚂蚁遮阳　3.小花；善良/坚强等</w:t>
+      </w:r>
+    </w:p>
+    <w:p>
+      <w:pPr>
+        <w:spacing w:before="0" w:after="20" w:line="252" w:lineRule="auto"/>
+      </w:pPr>
+      <w:r>
+        <w:rPr>
+          <w:rFonts w:ascii="宋体" w:hAnsi="宋体" w:eastAsia="宋体"/>
+          <w:b w:val="0"/>
+          <w:color w:val="1C1917"/>
+          <w:sz w:val="19"/>
+        </w:rPr>
+        <w:t>（二）1.③北戴河日出　2.非常广阔、没有边际　3.画面想象通顺即可　4.兴奋/赞美等</w:t>
+      </w:r>
+    </w:p>
+    <w:p>
+      <w:pPr>
+        <w:spacing w:before="80" w:after="20" w:line="252" w:lineRule="auto"/>
+      </w:pPr>
+      <w:r>
+        <w:rPr>
+          <w:rFonts w:ascii="宋体" w:hAnsi="宋体" w:eastAsia="宋体"/>
+          <w:b/>
+          <w:color w:val="E85D04"/>
+          <w:sz w:val="20"/>
+        </w:rPr>
+        <w:t>九、习作</w:t>
+      </w:r>
+    </w:p>
+    <w:p>
+      <w:pPr>
+        <w:spacing w:before="0" w:after="20" w:line="252" w:lineRule="auto"/>
+      </w:pPr>
+      <w:r>
+        <w:rPr>
+          <w:rFonts w:ascii="宋体" w:hAnsi="宋体" w:eastAsia="宋体"/>
+          <w:b w:val="0"/>
+          <w:color w:val="1C1917"/>
+          <w:sz w:val="19"/>
+        </w:rPr>
+        <w:t>略（地点清楚、特别之处与推荐理由）</w:t>
+      </w:r>
+    </w:p>
+    <w:p>
+      <w:pPr>
+        <w:spacing w:before="120" w:after="40" w:line="252" w:lineRule="auto"/>
       </w:pPr>
       <w:r>
         <w:rPr>
@@ -58,516 +324,12 @@
           <w:color w:val="C2410C"/>
           <w:sz w:val="18"/>
         </w:rPr>
-        <w:t>对应：`printables/full/u01-四上第一单元练习.docx` / `.pdf`</w:t>
-      </w:r>
-    </w:p>
-    <w:p>
-      <w:pPr>
-        <w:spacing w:before="0" w:after="80" w:line="269" w:lineRule="auto"/>
-      </w:pPr>
-      <w:r>
-        <w:rPr>
-          <w:rFonts w:ascii="宋体" w:hAnsi="宋体" w:eastAsia="宋体"/>
-          <w:b w:val="0"/>
-          <w:color w:val="C2410C"/>
-          <w:sz w:val="18"/>
-        </w:rPr>
-        <w:t>开放题给参考答法，意思对即可。</w:t>
-      </w:r>
-    </w:p>
-    <w:p>
-      <w:pPr>
-        <w:spacing w:before="160" w:after="80" w:line="269" w:lineRule="auto"/>
-      </w:pPr>
-      <w:r>
-        <w:rPr>
-          <w:rFonts w:ascii="宋体" w:hAnsi="宋体" w:eastAsia="宋体"/>
-          <w:b/>
-          <w:color w:val="E85D04"/>
-          <w:sz w:val="24"/>
-        </w:rPr>
-        <w:t>一、看拼音，写词语</w:t>
-      </w:r>
-    </w:p>
-    <w:p>
-      <w:pPr>
-        <w:spacing w:before="0" w:after="60" w:line="269" w:lineRule="auto"/>
-      </w:pPr>
-      <w:r>
-        <w:rPr>
-          <w:rFonts w:ascii="宋体" w:hAnsi="宋体" w:eastAsia="宋体"/>
-          <w:b w:val="0"/>
-          <w:color w:val="1C1917"/>
-          <w:sz w:val="22"/>
-        </w:rPr>
-        <w:t>繁星；模糊；飞舞；柔和；梦幻</w:t>
-      </w:r>
-    </w:p>
-    <w:p>
-      <w:pPr>
-        <w:spacing w:before="160" w:after="80" w:line="269" w:lineRule="auto"/>
-      </w:pPr>
-      <w:r>
-        <w:rPr>
-          <w:rFonts w:ascii="宋体" w:hAnsi="宋体" w:eastAsia="宋体"/>
-          <w:b/>
-          <w:color w:val="E85D04"/>
-          <w:sz w:val="24"/>
-        </w:rPr>
-        <w:t>二、读音有误（填序号）</w:t>
-      </w:r>
-    </w:p>
-    <w:p>
-      <w:pPr>
-        <w:spacing w:before="0" w:after="60" w:line="269" w:lineRule="auto"/>
-      </w:pPr>
-      <w:r>
-        <w:rPr>
-          <w:rFonts w:ascii="宋体" w:hAnsi="宋体" w:eastAsia="宋体"/>
-          <w:b w:val="0"/>
-          <w:color w:val="1C1917"/>
-          <w:sz w:val="22"/>
-        </w:rPr>
-        <w:t>1. ③（萤火虫应读 yíng，不作 yín）</w:t>
-      </w:r>
-    </w:p>
-    <w:p>
-      <w:pPr>
-        <w:spacing w:before="0" w:after="60" w:line="269" w:lineRule="auto"/>
-      </w:pPr>
-      <w:r>
-        <w:rPr>
-          <w:rFonts w:ascii="宋体" w:hAnsi="宋体" w:eastAsia="宋体"/>
-          <w:b w:val="0"/>
-          <w:color w:val="1C1917"/>
-          <w:sz w:val="22"/>
-        </w:rPr>
-        <w:t>2. ②（霎时应读 shà，不作 chà）</w:t>
-      </w:r>
-    </w:p>
-    <w:p>
-      <w:pPr>
-        <w:spacing w:before="0" w:after="60" w:line="269" w:lineRule="auto"/>
-      </w:pPr>
-      <w:r>
-        <w:rPr>
-          <w:rFonts w:ascii="宋体" w:hAnsi="宋体" w:eastAsia="宋体"/>
-          <w:b w:val="0"/>
-          <w:color w:val="1C1917"/>
-          <w:sz w:val="22"/>
-        </w:rPr>
-        <w:t>3. 无（本组读音均正确）</w:t>
-      </w:r>
-    </w:p>
-    <w:p>
-      <w:pPr>
-        <w:spacing w:before="0" w:after="60" w:line="269" w:lineRule="auto"/>
-      </w:pPr>
-      <w:r>
-        <w:rPr>
-          <w:rFonts w:ascii="宋体" w:hAnsi="宋体" w:eastAsia="宋体"/>
-          <w:b w:val="0"/>
-          <w:color w:val="1C1917"/>
-          <w:sz w:val="22"/>
-        </w:rPr>
-        <w:t>- 若卷面③印成 qiāo，则选③（悄无声息应读 qiǎo）</w:t>
-      </w:r>
-    </w:p>
-    <w:p>
-      <w:pPr>
-        <w:spacing w:before="160" w:after="80" w:line="269" w:lineRule="auto"/>
-      </w:pPr>
-      <w:r>
-        <w:rPr>
-          <w:rFonts w:ascii="宋体" w:hAnsi="宋体" w:eastAsia="宋体"/>
-          <w:b/>
-          <w:color w:val="E85D04"/>
-          <w:sz w:val="24"/>
-        </w:rPr>
-        <w:t>三、错别字（圈出错字，括号写正确字）</w:t>
-      </w:r>
-    </w:p>
-    <w:p>
-      <w:pPr>
-        <w:spacing w:before="0" w:after="60" w:line="269" w:lineRule="auto"/>
-      </w:pPr>
-      <w:r>
-        <w:rPr>
-          <w:rFonts w:ascii="宋体" w:hAnsi="宋体" w:eastAsia="宋体"/>
-          <w:b w:val="0"/>
-          <w:color w:val="1C1917"/>
-          <w:sz w:val="22"/>
-        </w:rPr>
-        <w:t>1. 蜜 → 密（密密麻麻）</w:t>
-      </w:r>
-    </w:p>
-    <w:p>
-      <w:pPr>
-        <w:spacing w:before="0" w:after="60" w:line="269" w:lineRule="auto"/>
-      </w:pPr>
-      <w:r>
-        <w:rPr>
-          <w:rFonts w:ascii="宋体" w:hAnsi="宋体" w:eastAsia="宋体"/>
-          <w:b w:val="0"/>
-          <w:color w:val="1C1917"/>
-          <w:sz w:val="22"/>
-        </w:rPr>
-        <w:t>2. 近 → 进（齐头并进）</w:t>
-      </w:r>
-    </w:p>
-    <w:p>
-      <w:pPr>
-        <w:spacing w:before="0" w:after="60" w:line="269" w:lineRule="auto"/>
-      </w:pPr>
-      <w:r>
-        <w:rPr>
-          <w:rFonts w:ascii="宋体" w:hAnsi="宋体" w:eastAsia="宋体"/>
-          <w:b w:val="0"/>
-          <w:color w:val="1C1917"/>
-          <w:sz w:val="22"/>
-        </w:rPr>
-        <w:t>3. 浙 → 渐（逐渐）</w:t>
-      </w:r>
-    </w:p>
-    <w:p>
-      <w:pPr>
-        <w:spacing w:before="160" w:after="80" w:line="269" w:lineRule="auto"/>
-      </w:pPr>
-      <w:r>
-        <w:rPr>
-          <w:rFonts w:ascii="宋体" w:hAnsi="宋体" w:eastAsia="宋体"/>
-          <w:b/>
-          <w:color w:val="E85D04"/>
-          <w:sz w:val="24"/>
-        </w:rPr>
-        <w:t>四、填空</w:t>
-      </w:r>
-    </w:p>
-    <w:p>
-      <w:pPr>
-        <w:spacing w:before="0" w:after="60" w:line="269" w:lineRule="auto"/>
-      </w:pPr>
-      <w:r>
-        <w:rPr>
-          <w:rFonts w:ascii="宋体" w:hAnsi="宋体" w:eastAsia="宋体"/>
-          <w:b w:val="0"/>
-          <w:color w:val="1C1917"/>
-          <w:sz w:val="22"/>
-        </w:rPr>
-        <w:t>第六笔：横</w:t>
-      </w:r>
-    </w:p>
-    <w:p>
-      <w:pPr>
-        <w:spacing w:before="0" w:after="60" w:line="269" w:lineRule="auto"/>
-      </w:pPr>
-      <w:r>
-        <w:rPr>
-          <w:rFonts w:ascii="宋体" w:hAnsi="宋体" w:eastAsia="宋体"/>
-          <w:b w:val="0"/>
-          <w:color w:val="1C1917"/>
-          <w:sz w:val="22"/>
-        </w:rPr>
-        <w:t>“外围”选第 ② 种解释（四周；周围）</w:t>
-      </w:r>
-    </w:p>
-    <w:p>
-      <w:pPr>
-        <w:spacing w:before="160" w:after="80" w:line="269" w:lineRule="auto"/>
-      </w:pPr>
-      <w:r>
-        <w:rPr>
-          <w:rFonts w:ascii="宋体" w:hAnsi="宋体" w:eastAsia="宋体"/>
-          <w:b/>
-          <w:color w:val="E85D04"/>
-          <w:sz w:val="24"/>
-        </w:rPr>
-        <w:t>五、词语补充与运用</w:t>
-      </w:r>
-    </w:p>
-    <w:p>
-      <w:pPr>
-        <w:spacing w:before="0" w:after="60" w:line="269" w:lineRule="auto"/>
-      </w:pPr>
-      <w:r>
-        <w:rPr>
-          <w:rFonts w:ascii="宋体" w:hAnsi="宋体" w:eastAsia="宋体"/>
-          <w:b w:val="0"/>
-          <w:color w:val="1C1917"/>
-          <w:sz w:val="22"/>
-        </w:rPr>
-        <w:t>①细　②无　③云　④悄　⑤私　⑥欲</w:t>
-      </w:r>
-    </w:p>
-    <w:p>
-      <w:pPr>
-        <w:spacing w:before="0" w:after="60" w:line="269" w:lineRule="auto"/>
-      </w:pPr>
-      <w:r>
-        <w:rPr>
-          <w:rFonts w:ascii="宋体" w:hAnsi="宋体" w:eastAsia="宋体"/>
-          <w:b w:val="0"/>
-          <w:color w:val="1C1917"/>
-          <w:sz w:val="22"/>
-        </w:rPr>
-        <w:t>1. ①②④⑤（低声细语、鸦雀无声、悄无声息、窃窃私语）</w:t>
-      </w:r>
-    </w:p>
-    <w:p>
-      <w:pPr>
-        <w:spacing w:before="0" w:after="60" w:line="269" w:lineRule="auto"/>
-      </w:pPr>
-      <w:r>
-        <w:rPr>
-          <w:rFonts w:ascii="宋体" w:hAnsi="宋体" w:eastAsia="宋体"/>
-          <w:b w:val="0"/>
-          <w:color w:val="1C1917"/>
-          <w:sz w:val="22"/>
-        </w:rPr>
-        <w:t>2. 示例：教室里大家都不说话，连一根针掉在地上都听得见。（合理即可）</w:t>
-      </w:r>
-    </w:p>
-    <w:p>
-      <w:pPr>
-        <w:spacing w:before="160" w:after="80" w:line="269" w:lineRule="auto"/>
-      </w:pPr>
-      <w:r>
-        <w:rPr>
-          <w:rFonts w:ascii="宋体" w:hAnsi="宋体" w:eastAsia="宋体"/>
-          <w:b/>
-          <w:color w:val="E85D04"/>
-          <w:sz w:val="24"/>
-        </w:rPr>
-        <w:t>六、片段描写</w:t>
-      </w:r>
-    </w:p>
-    <w:p>
-      <w:pPr>
-        <w:spacing w:before="0" w:after="60" w:line="269" w:lineRule="auto"/>
-      </w:pPr>
-      <w:r>
-        <w:rPr>
-          <w:rFonts w:ascii="宋体" w:hAnsi="宋体" w:eastAsia="宋体"/>
-          <w:b w:val="0"/>
-          <w:color w:val="1C1917"/>
-          <w:sz w:val="22"/>
-        </w:rPr>
-        <w:t>示例：忽然一阵风过，雪霎时厚了起来；过了一会儿，院子里白茫茫一片。（用上加点词、通顺即可）</w:t>
-      </w:r>
-    </w:p>
-    <w:p>
-      <w:pPr>
-        <w:spacing w:before="160" w:after="80" w:line="269" w:lineRule="auto"/>
-      </w:pPr>
-      <w:r>
-        <w:rPr>
-          <w:rFonts w:ascii="宋体" w:hAnsi="宋体" w:eastAsia="宋体"/>
-          <w:b/>
-          <w:color w:val="E85D04"/>
-          <w:sz w:val="24"/>
-        </w:rPr>
-        <w:t>七、古诗</w:t>
-      </w:r>
-    </w:p>
-    <w:p>
-      <w:pPr>
-        <w:spacing w:before="0" w:after="60" w:line="269" w:lineRule="auto"/>
-      </w:pPr>
-      <w:r>
-        <w:rPr>
-          <w:rFonts w:ascii="宋体" w:hAnsi="宋体" w:eastAsia="宋体"/>
-          <w:b w:val="0"/>
-          <w:color w:val="1C1917"/>
-          <w:sz w:val="22"/>
-        </w:rPr>
-        <w:t>宋　苏轼　（ ② ）</w:t>
-      </w:r>
-    </w:p>
-    <w:p>
-      <w:pPr>
-        <w:spacing w:before="160" w:after="80" w:line="269" w:lineRule="auto"/>
-      </w:pPr>
-      <w:r>
-        <w:rPr>
-          <w:rFonts w:ascii="宋体" w:hAnsi="宋体" w:eastAsia="宋体"/>
-          <w:b/>
-          <w:color w:val="E85D04"/>
-          <w:sz w:val="24"/>
-        </w:rPr>
-        <w:t>八、阅读</w:t>
-      </w:r>
-    </w:p>
-    <w:p>
-      <w:pPr>
-        <w:spacing w:before="0" w:after="60" w:line="269" w:lineRule="auto"/>
-      </w:pPr>
-      <w:r>
-        <w:rPr>
-          <w:rFonts w:ascii="宋体" w:hAnsi="宋体" w:eastAsia="宋体"/>
-          <w:b w:val="0"/>
-          <w:color w:val="1C1917"/>
-          <w:sz w:val="22"/>
-        </w:rPr>
-        <w:t>（一）一朵淡紫色的小花</w:t>
-      </w:r>
-    </w:p>
-    <w:p>
-      <w:pPr>
-        <w:spacing w:before="0" w:after="60" w:line="269" w:lineRule="auto"/>
-      </w:pPr>
-      <w:r>
-        <w:rPr>
-          <w:rFonts w:ascii="宋体" w:hAnsi="宋体" w:eastAsia="宋体"/>
-          <w:b w:val="0"/>
-          <w:color w:val="1C1917"/>
-          <w:sz w:val="22"/>
-        </w:rPr>
-        <w:t>1. （②淡紫色）（①文雅）</w:t>
-      </w:r>
-    </w:p>
-    <w:p>
-      <w:pPr>
-        <w:spacing w:before="0" w:after="60" w:line="269" w:lineRule="auto"/>
-      </w:pPr>
-      <w:r>
-        <w:rPr>
-          <w:rFonts w:ascii="宋体" w:hAnsi="宋体" w:eastAsia="宋体"/>
-          <w:b w:val="0"/>
-          <w:color w:val="1C1917"/>
-          <w:sz w:val="22"/>
-        </w:rPr>
-        <w:t>2. 画：却也能为一个可怜的蚂蚁遮阳。</w:t>
-      </w:r>
-    </w:p>
-    <w:p>
-      <w:pPr>
-        <w:spacing w:before="0" w:after="60" w:line="269" w:lineRule="auto"/>
-      </w:pPr>
-      <w:r>
-        <w:rPr>
-          <w:rFonts w:ascii="宋体" w:hAnsi="宋体" w:eastAsia="宋体"/>
-          <w:b w:val="0"/>
-          <w:color w:val="1C1917"/>
-          <w:sz w:val="22"/>
-        </w:rPr>
-        <w:t>3. 一朵淡紫色的小花；示例：善良 / 坚强 / 无私（合理即可）</w:t>
-      </w:r>
-    </w:p>
-    <w:p>
-      <w:pPr>
-        <w:spacing w:before="0" w:after="60" w:line="269" w:lineRule="auto"/>
-      </w:pPr>
-      <w:r>
-        <w:rPr>
-          <w:rFonts w:ascii="宋体" w:hAnsi="宋体" w:eastAsia="宋体"/>
-          <w:b w:val="0"/>
-          <w:color w:val="1C1917"/>
-          <w:sz w:val="22"/>
-        </w:rPr>
-        <w:t>（二）短文</w:t>
-      </w:r>
-    </w:p>
-    <w:p>
-      <w:pPr>
-        <w:spacing w:before="0" w:after="60" w:line="269" w:lineRule="auto"/>
-      </w:pPr>
-      <w:r>
-        <w:rPr>
-          <w:rFonts w:ascii="宋体" w:hAnsi="宋体" w:eastAsia="宋体"/>
-          <w:b w:val="0"/>
-          <w:color w:val="1C1917"/>
-          <w:sz w:val="22"/>
-        </w:rPr>
-        <w:t>1. 题目选 ③北戴河日出（写在文前横线）</w:t>
-      </w:r>
-    </w:p>
-    <w:p>
-      <w:pPr>
-        <w:spacing w:before="0" w:after="60" w:line="269" w:lineRule="auto"/>
-      </w:pPr>
-      <w:r>
-        <w:rPr>
-          <w:rFonts w:ascii="宋体" w:hAnsi="宋体" w:eastAsia="宋体"/>
-          <w:b w:val="0"/>
-          <w:color w:val="1C1917"/>
-          <w:sz w:val="22"/>
-        </w:rPr>
-        <w:t>2. 非常广阔，没有边际（意思对即可）</w:t>
-      </w:r>
-    </w:p>
-    <w:p>
-      <w:pPr>
-        <w:spacing w:before="0" w:after="60" w:line="269" w:lineRule="auto"/>
-      </w:pPr>
-      <w:r>
-        <w:rPr>
-          <w:rFonts w:ascii="宋体" w:hAnsi="宋体" w:eastAsia="宋体"/>
-          <w:b w:val="0"/>
-          <w:color w:val="1C1917"/>
-          <w:sz w:val="22"/>
-        </w:rPr>
-        <w:t>3. 示例：太阳像攒足了力气，一下子跳出海面，把海天都染红了。（合理即可）</w:t>
-      </w:r>
-    </w:p>
-    <w:p>
-      <w:pPr>
-        <w:spacing w:before="0" w:after="60" w:line="269" w:lineRule="auto"/>
-      </w:pPr>
-      <w:r>
-        <w:rPr>
-          <w:rFonts w:ascii="宋体" w:hAnsi="宋体" w:eastAsia="宋体"/>
-          <w:b w:val="0"/>
-          <w:color w:val="1C1917"/>
-          <w:sz w:val="22"/>
-        </w:rPr>
-        <w:t>4. 示例：兴奋 / 赞美 / 喜爱 / 惊叹（合理即可）</w:t>
-      </w:r>
-    </w:p>
-    <w:p>
-      <w:pPr>
-        <w:spacing w:before="160" w:after="80" w:line="269" w:lineRule="auto"/>
-      </w:pPr>
-      <w:r>
-        <w:rPr>
-          <w:rFonts w:ascii="宋体" w:hAnsi="宋体" w:eastAsia="宋体"/>
-          <w:b/>
-          <w:color w:val="E85D04"/>
-          <w:sz w:val="24"/>
-        </w:rPr>
-        <w:t>九、习作</w:t>
-      </w:r>
-    </w:p>
-    <w:p>
-      <w:pPr>
-        <w:spacing w:before="0" w:after="60" w:line="269" w:lineRule="auto"/>
-      </w:pPr>
-      <w:r>
-        <w:rPr>
-          <w:rFonts w:ascii="宋体" w:hAnsi="宋体" w:eastAsia="宋体"/>
-          <w:b w:val="0"/>
-          <w:color w:val="1C1917"/>
-          <w:sz w:val="22"/>
-        </w:rPr>
-        <w:t>略（语句通顺、条理清楚，写清地点、特别之处与推荐理由）</w:t>
-      </w:r>
-    </w:p>
-    <w:p>
-      <w:pPr>
-        <w:spacing w:before="200" w:after="60" w:line="269" w:lineRule="auto"/>
-      </w:pPr>
-      <w:r>
-        <w:rPr>
-          <w:rFonts w:ascii="宋体" w:hAnsi="宋体" w:eastAsia="宋体"/>
-          <w:b w:val="0"/>
-          <w:color w:val="C2410C"/>
-          <w:sz w:val="20"/>
-        </w:rPr>
         <w:t>□已对答案　□错题已入档</w:t>
       </w:r>
     </w:p>
     <w:sectPr>
       <w:pgSz w:w="11906" w:h="16838"/>
-      <w:pgMar w:top="794" w:right="964" w:bottom="794" w:left="964" w:header="720" w:footer="720" w:gutter="0"/>
+      <w:pgMar w:top="624" w:right="737" w:bottom="624" w:left="737" w:header="720" w:footer="720" w:gutter="0"/>
       <w:cols w:space="720"/>
       <w:docGrid w:linePitch="360"/>
     </w:sectPr>
@@ -940,7 +702,7 @@
     <w:rsid w:val="00FC693F"/>
     <w:rPr>
       <w:rFonts w:ascii="宋体" w:hAnsi="宋体" w:eastAsia="宋体"/>
-      <w:sz w:val="22"/>
+      <w:sz w:val="20"/>
     </w:rPr>
   </w:style>
   <w:style w:type="paragraph" w:styleId="Header">

</xml_diff>